<commit_message>
docs: update Windows LAN guide and identify test certificates
</commit_message>
<xml_diff>
--- a/documentation/ECDAT_Technical_Reference.docx
+++ b/documentation/ECDAT_Technical_Reference.docx
@@ -8,6 +8,9 @@
         <w:jc w:val="left"/>
       </w:pPr>
       <w:r>
+        <w:rPr>
+          <w:color w:val="000000"/>
+        </w:rPr>
         <w:t>ECDAT Project Architecture and Technical Reference</w:t>
       </w:r>
     </w:p>
@@ -173,7 +176,7 @@
           </w:tcPr>
           <w:p>
             <w:r>
-              <w:t>Git commit 398f8f1</w:t>
+              <w:t>Working tree based on 79ebb9e</w:t>
             </w:r>
           </w:p>
         </w:tc>
@@ -214,7 +217,7 @@
           </w:tcPr>
           <w:p>
             <w:r>
-              <w:t>08 September 2026</w:t>
+              <w:t>09 September 2026</w:t>
             </w:r>
           </w:p>
         </w:tc>
@@ -226,11 +229,7 @@
         <w:spacing w:before="280"/>
       </w:pPr>
       <w:r>
-        <w:rPr>
-          <w:i/>
-          <w:color w:val="596370"/>
-        </w:rPr>
-        <w:t>Prepared for local review before any upstream pull request or merge.</w:t>
+        <w:t>Use documentation/SETUP_AND_RUN.md for current installation and operation commands.</w:t>
       </w:r>
     </w:p>
     <w:p>
@@ -243,6 +242,9 @@
         <w:pStyle w:val="Heading1"/>
       </w:pPr>
       <w:r>
+        <w:rPr>
+          <w:color w:val="000000"/>
+        </w:rPr>
         <w:t>Project Summary</w:t>
       </w:r>
     </w:p>
@@ -261,6 +263,9 @@
         <w:pStyle w:val="Heading1"/>
       </w:pPr>
       <w:r>
+        <w:rPr>
+          <w:color w:val="000000"/>
+        </w:rPr>
         <w:t>Implemented Outcome</w:t>
       </w:r>
     </w:p>
@@ -384,7 +389,7 @@
             <w:r>
               <w:rPr>
                 <w:rFonts w:ascii="Arial" w:hAnsi="Arial"/>
-                <w:sz w:val="17"/>
+                <w:sz w:val="18"/>
               </w:rPr>
               <w:t>Input handling</w:t>
             </w:r>
@@ -408,7 +413,7 @@
             <w:r>
               <w:rPr>
                 <w:rFonts w:ascii="Arial" w:hAnsi="Arial"/>
-                <w:sz w:val="17"/>
+                <w:sz w:val="18"/>
               </w:rPr>
               <w:t>Path, HTTPS Git, file, ZIP, offline image inventory, and optional live image input</w:t>
             </w:r>
@@ -432,7 +437,7 @@
             <w:r>
               <w:rPr>
                 <w:rFonts w:ascii="Arial" w:hAnsi="Arial"/>
-                <w:sz w:val="17"/>
+                <w:sz w:val="18"/>
               </w:rPr>
               <w:t>Implemented</w:t>
             </w:r>
@@ -462,7 +467,7 @@
             <w:r>
               <w:rPr>
                 <w:rFonts w:ascii="Arial" w:hAnsi="Arial"/>
-                <w:sz w:val="17"/>
+                <w:sz w:val="18"/>
               </w:rPr>
               <w:t>Discovery</w:t>
             </w:r>
@@ -487,7 +492,7 @@
             <w:r>
               <w:rPr>
                 <w:rFonts w:ascii="Arial" w:hAnsi="Arial"/>
-                <w:sz w:val="17"/>
+                <w:sz w:val="18"/>
               </w:rPr>
               <w:t>Source, dependency and binary, configuration, IaC, certificate, and package evidence</w:t>
             </w:r>
@@ -512,7 +517,7 @@
             <w:r>
               <w:rPr>
                 <w:rFonts w:ascii="Arial" w:hAnsi="Arial"/>
-                <w:sz w:val="17"/>
+                <w:sz w:val="18"/>
               </w:rPr>
               <w:t>Implemented</w:t>
             </w:r>
@@ -541,7 +546,7 @@
             <w:r>
               <w:rPr>
                 <w:rFonts w:ascii="Arial" w:hAnsi="Arial"/>
-                <w:sz w:val="17"/>
+                <w:sz w:val="18"/>
               </w:rPr>
               <w:t>Analysis</w:t>
             </w:r>
@@ -565,7 +570,7 @@
             <w:r>
               <w:rPr>
                 <w:rFonts w:ascii="Arial" w:hAnsi="Arial"/>
-                <w:sz w:val="17"/>
+                <w:sz w:val="18"/>
               </w:rPr>
               <w:t>Normalization, Mosca urgency, composite risk, and migration guidance</w:t>
             </w:r>
@@ -589,7 +594,7 @@
             <w:r>
               <w:rPr>
                 <w:rFonts w:ascii="Arial" w:hAnsi="Arial"/>
-                <w:sz w:val="17"/>
+                <w:sz w:val="18"/>
               </w:rPr>
               <w:t>Implemented</w:t>
             </w:r>
@@ -619,7 +624,7 @@
             <w:r>
               <w:rPr>
                 <w:rFonts w:ascii="Arial" w:hAnsi="Arial"/>
-                <w:sz w:val="17"/>
+                <w:sz w:val="18"/>
               </w:rPr>
               <w:t>Experience</w:t>
             </w:r>
@@ -638,15 +643,11 @@
             <w:shd w:fill="F4F7FA"/>
           </w:tcPr>
           <w:p>
-            <w:pPr>
-              <w:spacing w:after="0" w:line="252" w:lineRule="auto"/>
-            </w:pPr>
             <w:r>
               <w:rPr>
-                <w:rFonts w:ascii="Arial" w:hAnsi="Arial"/>
-                <w:sz w:val="17"/>
+                <w:sz w:val="18"/>
               </w:rPr>
-              <w:t>Responsive overview, inventory, detail, heatmap, recommendations, and history</w:t>
+              <w:t>Responsive analysis, grouped heatmap, report exports and history deletion</w:t>
             </w:r>
           </w:p>
         </w:tc>
@@ -669,7 +670,7 @@
             <w:r>
               <w:rPr>
                 <w:rFonts w:ascii="Arial" w:hAnsi="Arial"/>
-                <w:sz w:val="17"/>
+                <w:sz w:val="18"/>
               </w:rPr>
               <w:t>Implemented</w:t>
             </w:r>
@@ -698,7 +699,7 @@
             <w:r>
               <w:rPr>
                 <w:rFonts w:ascii="Arial" w:hAnsi="Arial"/>
-                <w:sz w:val="17"/>
+                <w:sz w:val="18"/>
               </w:rPr>
               <w:t>Exports</w:t>
             </w:r>
@@ -722,7 +723,7 @@
             <w:r>
               <w:rPr>
                 <w:rFonts w:ascii="Arial" w:hAnsi="Arial"/>
-                <w:sz w:val="17"/>
+                <w:sz w:val="18"/>
               </w:rPr>
               <w:t>PDF, CSV, XLSX, and CycloneDX aligned JSON</w:t>
             </w:r>
@@ -746,7 +747,7 @@
             <w:r>
               <w:rPr>
                 <w:rFonts w:ascii="Arial" w:hAnsi="Arial"/>
-                <w:sz w:val="17"/>
+                <w:sz w:val="18"/>
               </w:rPr>
               <w:t>Implemented</w:t>
             </w:r>
@@ -776,7 +777,7 @@
             <w:r>
               <w:rPr>
                 <w:rFonts w:ascii="Arial" w:hAnsi="Arial"/>
-                <w:sz w:val="17"/>
+                <w:sz w:val="18"/>
               </w:rPr>
               <w:t>Production platform</w:t>
             </w:r>
@@ -801,7 +802,7 @@
             <w:r>
               <w:rPr>
                 <w:rFonts w:ascii="Arial" w:hAnsi="Arial"/>
-                <w:sz w:val="17"/>
+                <w:sz w:val="18"/>
               </w:rPr>
               <w:t>Distributed work, RBAC, SSO, observability, and managed deployment</w:t>
             </w:r>
@@ -826,7 +827,7 @@
             <w:r>
               <w:rPr>
                 <w:rFonts w:ascii="Arial" w:hAnsi="Arial"/>
-                <w:sz w:val="17"/>
+                <w:sz w:val="18"/>
               </w:rPr>
               <w:t>Future scope</w:t>
             </w:r>
@@ -841,7 +842,7 @@
     </w:p>
     <w:p>
       <w:r>
-        <w:t>Verified review results were 10 assets with 3 Critical findings for the supplied workspace, 2 assets for the offline image inventory, and 51 assets for a public Git scan of this repository. The backend test suite passed 66 tests, the frontend passed 14 tests, and the production frontend build completed successfully.</w:t>
+        <w:t>The supplied workspace produces 10 assets with 3 Critical findings, and the offline image inventory produces 2 assets. Git scan counts vary with repository content. The updated build passes 83 backend tests, 23 frontend tests and a production build. Browser checks cover grouped heatmap navigation, decimal formatting, confirmation and persistent history deletion.</w:t>
       </w:r>
     </w:p>
     <w:p>
@@ -849,6 +850,9 @@
         <w:pStyle w:val="Heading1"/>
       </w:pPr>
       <w:r>
+        <w:rPr>
+          <w:color w:val="000000"/>
+        </w:rPr>
         <w:t>System Architecture</w:t>
       </w:r>
     </w:p>
@@ -914,6 +918,9 @@
         <w:pStyle w:val="Heading1"/>
       </w:pPr>
       <w:r>
+        <w:rPr>
+          <w:color w:val="000000"/>
+        </w:rPr>
         <w:t>Processing Flow</w:t>
       </w:r>
     </w:p>
@@ -1006,6 +1013,9 @@
         <w:pStyle w:val="Heading1"/>
       </w:pPr>
       <w:r>
+        <w:rPr>
+          <w:color w:val="000000"/>
+        </w:rPr>
         <w:t>Module Structure</w:t>
       </w:r>
     </w:p>
@@ -1154,7 +1164,7 @@
             <w:r>
               <w:rPr>
                 <w:rFonts w:ascii="Arial" w:hAnsi="Arial"/>
-                <w:sz w:val="16"/>
+                <w:sz w:val="18"/>
               </w:rPr>
               <w:t>M1 Source scanner</w:t>
             </w:r>
@@ -1178,7 +1188,7 @@
             <w:r>
               <w:rPr>
                 <w:rFonts w:ascii="Arial" w:hAnsi="Arial"/>
-                <w:sz w:val="16"/>
+                <w:sz w:val="18"/>
               </w:rPr>
               <w:t>Find cryptographic API and algorithm signals in source code.</w:t>
             </w:r>
@@ -1202,7 +1212,7 @@
             <w:r>
               <w:rPr>
                 <w:rFonts w:ascii="Arial" w:hAnsi="Arial"/>
-                <w:sz w:val="16"/>
+                <w:sz w:val="18"/>
               </w:rPr>
               <w:t>backend/scanners/source</w:t>
             </w:r>
@@ -1226,7 +1236,7 @@
             <w:r>
               <w:rPr>
                 <w:rFonts w:ascii="Arial" w:hAnsi="Arial"/>
-                <w:sz w:val="16"/>
+                <w:sz w:val="18"/>
               </w:rPr>
               <w:t>Signal rules and Tree sitter grammars</w:t>
             </w:r>
@@ -1256,7 +1266,7 @@
             <w:r>
               <w:rPr>
                 <w:rFonts w:ascii="Arial" w:hAnsi="Arial"/>
-                <w:sz w:val="16"/>
+                <w:sz w:val="18"/>
               </w:rPr>
               <w:t>M2 Dependency and binary scanner</w:t>
             </w:r>
@@ -1281,7 +1291,7 @@
             <w:r>
               <w:rPr>
                 <w:rFonts w:ascii="Arial" w:hAnsi="Arial"/>
-                <w:sz w:val="16"/>
+                <w:sz w:val="18"/>
               </w:rPr>
               <w:t>Identify cryptographic packages, versions, symbols, and banners.</w:t>
             </w:r>
@@ -1306,7 +1316,7 @@
             <w:r>
               <w:rPr>
                 <w:rFonts w:ascii="Arial" w:hAnsi="Arial"/>
-                <w:sz w:val="16"/>
+                <w:sz w:val="18"/>
               </w:rPr>
               <w:t>backend/scanners/binary_deps</w:t>
             </w:r>
@@ -1331,7 +1341,7 @@
             <w:r>
               <w:rPr>
                 <w:rFonts w:ascii="Arial" w:hAnsi="Arial"/>
-                <w:sz w:val="16"/>
+                <w:sz w:val="18"/>
               </w:rPr>
               <w:t>Manifest parsers and registry.json</w:t>
             </w:r>
@@ -1360,7 +1370,7 @@
             <w:r>
               <w:rPr>
                 <w:rFonts w:ascii="Arial" w:hAnsi="Arial"/>
-                <w:sz w:val="16"/>
+                <w:sz w:val="18"/>
               </w:rPr>
               <w:t>M3 Infrastructure scanner</w:t>
             </w:r>
@@ -1384,7 +1394,7 @@
             <w:r>
               <w:rPr>
                 <w:rFonts w:ascii="Arial" w:hAnsi="Arial"/>
-                <w:sz w:val="16"/>
+                <w:sz w:val="18"/>
               </w:rPr>
               <w:t>Inspect TLS configuration, IaC, certificates, and image package evidence.</w:t>
             </w:r>
@@ -1408,7 +1418,7 @@
             <w:r>
               <w:rPr>
                 <w:rFonts w:ascii="Arial" w:hAnsi="Arial"/>
-                <w:sz w:val="16"/>
+                <w:sz w:val="18"/>
               </w:rPr>
               <w:t>backend/scanners/infra</w:t>
             </w:r>
@@ -1432,7 +1442,7 @@
             <w:r>
               <w:rPr>
                 <w:rFonts w:ascii="Arial" w:hAnsi="Arial"/>
-                <w:sz w:val="16"/>
+                <w:sz w:val="18"/>
               </w:rPr>
               <w:t>cryptography, PyYAML, optional Trivy</w:t>
             </w:r>
@@ -1462,7 +1472,7 @@
             <w:r>
               <w:rPr>
                 <w:rFonts w:ascii="Arial" w:hAnsi="Arial"/>
-                <w:sz w:val="16"/>
+                <w:sz w:val="18"/>
               </w:rPr>
               <w:t>M4 Normalizer</w:t>
             </w:r>
@@ -1487,7 +1497,7 @@
             <w:r>
               <w:rPr>
                 <w:rFonts w:ascii="Arial" w:hAnsi="Arial"/>
-                <w:sz w:val="16"/>
+                <w:sz w:val="18"/>
               </w:rPr>
               <w:t>Provide one canonical asset contract for every scanner.</w:t>
             </w:r>
@@ -1512,7 +1522,7 @@
             <w:r>
               <w:rPr>
                 <w:rFonts w:ascii="Arial" w:hAnsi="Arial"/>
-                <w:sz w:val="16"/>
+                <w:sz w:val="18"/>
               </w:rPr>
               <w:t>backend/engine/normalizer.py</w:t>
             </w:r>
@@ -1537,7 +1547,7 @@
             <w:r>
               <w:rPr>
                 <w:rFonts w:ascii="Arial" w:hAnsi="Arial"/>
-                <w:sz w:val="16"/>
+                <w:sz w:val="18"/>
               </w:rPr>
               <w:t>RawFinding and canonical schemas</w:t>
             </w:r>
@@ -1566,7 +1576,7 @@
             <w:r>
               <w:rPr>
                 <w:rFonts w:ascii="Arial" w:hAnsi="Arial"/>
-                <w:sz w:val="16"/>
+                <w:sz w:val="18"/>
               </w:rPr>
               <w:t>M5 Risk engine</w:t>
             </w:r>
@@ -1590,7 +1600,7 @@
             <w:r>
               <w:rPr>
                 <w:rFonts w:ascii="Arial" w:hAnsi="Arial"/>
-                <w:sz w:val="16"/>
+                <w:sz w:val="18"/>
               </w:rPr>
               <w:t>Make migration urgency explainable and configurable.</w:t>
             </w:r>
@@ -1614,7 +1624,7 @@
             <w:r>
               <w:rPr>
                 <w:rFonts w:ascii="Arial" w:hAnsi="Arial"/>
-                <w:sz w:val="16"/>
+                <w:sz w:val="18"/>
               </w:rPr>
               <w:t>backend/engine/risk.py</w:t>
             </w:r>
@@ -1638,7 +1648,7 @@
             <w:r>
               <w:rPr>
                 <w:rFonts w:ascii="Arial" w:hAnsi="Arial"/>
-                <w:sz w:val="16"/>
+                <w:sz w:val="18"/>
               </w:rPr>
               <w:t>X shelf life, Y migration time, Z threat timeline</w:t>
             </w:r>
@@ -1668,7 +1678,7 @@
             <w:r>
               <w:rPr>
                 <w:rFonts w:ascii="Arial" w:hAnsi="Arial"/>
-                <w:sz w:val="16"/>
+                <w:sz w:val="18"/>
               </w:rPr>
               <w:t>M6 Recommender</w:t>
             </w:r>
@@ -1693,7 +1703,7 @@
             <w:r>
               <w:rPr>
                 <w:rFonts w:ascii="Arial" w:hAnsi="Arial"/>
-                <w:sz w:val="16"/>
+                <w:sz w:val="18"/>
               </w:rPr>
               <w:t>Translate risk into a reviewable migration direction.</w:t>
             </w:r>
@@ -1718,7 +1728,7 @@
             <w:r>
               <w:rPr>
                 <w:rFonts w:ascii="Arial" w:hAnsi="Arial"/>
-                <w:sz w:val="16"/>
+                <w:sz w:val="18"/>
               </w:rPr>
               <w:t>backend/engine/recommend.py</w:t>
             </w:r>
@@ -1743,7 +1753,7 @@
             <w:r>
               <w:rPr>
                 <w:rFonts w:ascii="Arial" w:hAnsi="Arial"/>
-                <w:sz w:val="16"/>
+                <w:sz w:val="18"/>
               </w:rPr>
               <w:t>Primitive category, algorithm, policy target</w:t>
             </w:r>
@@ -1772,7 +1782,7 @@
             <w:r>
               <w:rPr>
                 <w:rFonts w:ascii="Arial" w:hAnsi="Arial"/>
-                <w:sz w:val="16"/>
+                <w:sz w:val="18"/>
               </w:rPr>
               <w:t>M7 API and orchestration</w:t>
             </w:r>
@@ -1796,7 +1806,7 @@
             <w:r>
               <w:rPr>
                 <w:rFonts w:ascii="Arial" w:hAnsi="Arial"/>
-                <w:sz w:val="16"/>
+                <w:sz w:val="18"/>
               </w:rPr>
               <w:t>Manage jobs, persistence, configuration, and API contracts.</w:t>
             </w:r>
@@ -1820,7 +1830,7 @@
             <w:r>
               <w:rPr>
                 <w:rFonts w:ascii="Arial" w:hAnsi="Arial"/>
-                <w:sz w:val="16"/>
+                <w:sz w:val="18"/>
               </w:rPr>
               <w:t>backend/api backend/engine/jobs.py backend/models</w:t>
             </w:r>
@@ -1838,15 +1848,11 @@
             </w:tcMar>
           </w:tcPr>
           <w:p>
-            <w:pPr>
-              <w:spacing w:after="0" w:line="252" w:lineRule="auto"/>
-            </w:pPr>
             <w:r>
               <w:rPr>
-                <w:rFonts w:ascii="Arial" w:hAnsi="Arial"/>
-                <w:sz w:val="16"/>
+                <w:sz w:val="18"/>
               </w:rPr>
-              <w:t>FastAPI, Pydantic, SQLAlchemy</w:t>
+              <w:t>FastAPI, Pydantic, SQLAlchemy, filelock</w:t>
             </w:r>
           </w:p>
         </w:tc>
@@ -1874,7 +1880,7 @@
             <w:r>
               <w:rPr>
                 <w:rFonts w:ascii="Arial" w:hAnsi="Arial"/>
-                <w:sz w:val="16"/>
+                <w:sz w:val="18"/>
               </w:rPr>
               <w:t>M8 Dashboard</w:t>
             </w:r>
@@ -1899,7 +1905,7 @@
             <w:r>
               <w:rPr>
                 <w:rFonts w:ascii="Arial" w:hAnsi="Arial"/>
-                <w:sz w:val="16"/>
+                <w:sz w:val="18"/>
               </w:rPr>
               <w:t>Give users a practical way to start scans and interpret findings.</w:t>
             </w:r>
@@ -1924,7 +1930,7 @@
             <w:r>
               <w:rPr>
                 <w:rFonts w:ascii="Arial" w:hAnsi="Arial"/>
-                <w:sz w:val="16"/>
+                <w:sz w:val="18"/>
               </w:rPr>
               <w:t>frontend/src</w:t>
             </w:r>
@@ -1949,7 +1955,7 @@
             <w:r>
               <w:rPr>
                 <w:rFonts w:ascii="Arial" w:hAnsi="Arial"/>
-                <w:sz w:val="16"/>
+                <w:sz w:val="18"/>
               </w:rPr>
               <w:t>React, TypeScript, Vite, Tailwind CSS</w:t>
             </w:r>
@@ -1978,7 +1984,7 @@
             <w:r>
               <w:rPr>
                 <w:rFonts w:ascii="Arial" w:hAnsi="Arial"/>
-                <w:sz w:val="16"/>
+                <w:sz w:val="18"/>
               </w:rPr>
               <w:t>M9 Reporting</w:t>
             </w:r>
@@ -2002,7 +2008,7 @@
             <w:r>
               <w:rPr>
                 <w:rFonts w:ascii="Arial" w:hAnsi="Arial"/>
-                <w:sz w:val="16"/>
+                <w:sz w:val="18"/>
               </w:rPr>
               <w:t>Create portable evidence for review and downstream work.</w:t>
             </w:r>
@@ -2026,7 +2032,7 @@
             <w:r>
               <w:rPr>
                 <w:rFonts w:ascii="Arial" w:hAnsi="Arial"/>
-                <w:sz w:val="16"/>
+                <w:sz w:val="18"/>
               </w:rPr>
               <w:t>backend/api/reports.py backend/api/cbom.py</w:t>
             </w:r>
@@ -2050,7 +2056,7 @@
             <w:r>
               <w:rPr>
                 <w:rFonts w:ascii="Arial" w:hAnsi="Arial"/>
-                <w:sz w:val="16"/>
+                <w:sz w:val="18"/>
               </w:rPr>
               <w:t>ReportLab, openpyxl, stored scan data</w:t>
             </w:r>
@@ -2073,6 +2079,9 @@
         <w:pStyle w:val="Heading1"/>
       </w:pPr>
       <w:r>
+        <w:rPr>
+          <w:color w:val="000000"/>
+        </w:rPr>
         <w:t>Data Model and Risk Logic</w:t>
       </w:r>
     </w:p>
@@ -2081,6 +2090,9 @@
         <w:pStyle w:val="Heading2"/>
       </w:pPr>
       <w:r>
+        <w:rPr>
+          <w:color w:val="000000"/>
+        </w:rPr>
         <w:t>Scanner Boundary</w:t>
       </w:r>
     </w:p>
@@ -2094,6 +2106,9 @@
         <w:pStyle w:val="Heading2"/>
       </w:pPr>
       <w:r>
+        <w:rPr>
+          <w:color w:val="000000"/>
+        </w:rPr>
         <w:t>Canonical Asset</w:t>
       </w:r>
     </w:p>
@@ -2107,6 +2122,9 @@
         <w:pStyle w:val="Heading2"/>
       </w:pPr>
       <w:r>
+        <w:rPr>
+          <w:color w:val="000000"/>
+        </w:rPr>
         <w:t>Risk Calculation</w:t>
       </w:r>
     </w:p>
@@ -2125,6 +2143,9 @@
         <w:pStyle w:val="Heading1"/>
       </w:pPr>
       <w:r>
+        <w:rPr>
+          <w:color w:val="000000"/>
+        </w:rPr>
         <w:t>Technology Stack</w:t>
       </w:r>
     </w:p>
@@ -2248,7 +2269,7 @@
             <w:r>
               <w:rPr>
                 <w:rFonts w:ascii="Arial" w:hAnsi="Arial"/>
-                <w:sz w:val="17"/>
+                <w:sz w:val="18"/>
               </w:rPr>
               <w:t>Frontend</w:t>
             </w:r>
@@ -2272,7 +2293,7 @@
             <w:r>
               <w:rPr>
                 <w:rFonts w:ascii="Arial" w:hAnsi="Arial"/>
-                <w:sz w:val="17"/>
+                <w:sz w:val="18"/>
               </w:rPr>
               <w:t>React 18 and TypeScript</w:t>
             </w:r>
@@ -2296,7 +2317,7 @@
             <w:r>
               <w:rPr>
                 <w:rFonts w:ascii="Arial" w:hAnsi="Arial"/>
-                <w:sz w:val="17"/>
+                <w:sz w:val="18"/>
               </w:rPr>
               <w:t>Component based interface and typed API mapping</w:t>
             </w:r>
@@ -2326,7 +2347,7 @@
             <w:r>
               <w:rPr>
                 <w:rFonts w:ascii="Arial" w:hAnsi="Arial"/>
-                <w:sz w:val="17"/>
+                <w:sz w:val="18"/>
               </w:rPr>
               <w:t>Frontend build</w:t>
             </w:r>
@@ -2351,7 +2372,7 @@
             <w:r>
               <w:rPr>
                 <w:rFonts w:ascii="Arial" w:hAnsi="Arial"/>
-                <w:sz w:val="17"/>
+                <w:sz w:val="18"/>
               </w:rPr>
               <w:t>Vite 6 and Tailwind CSS 3</w:t>
             </w:r>
@@ -2376,7 +2397,7 @@
             <w:r>
               <w:rPr>
                 <w:rFonts w:ascii="Arial" w:hAnsi="Arial"/>
-                <w:sz w:val="17"/>
+                <w:sz w:val="18"/>
               </w:rPr>
               <w:t>Development proxy, production bundle, and responsive styling</w:t>
             </w:r>
@@ -2405,7 +2426,7 @@
             <w:r>
               <w:rPr>
                 <w:rFonts w:ascii="Arial" w:hAnsi="Arial"/>
-                <w:sz w:val="17"/>
+                <w:sz w:val="18"/>
               </w:rPr>
               <w:t>API</w:t>
             </w:r>
@@ -2429,7 +2450,7 @@
             <w:r>
               <w:rPr>
                 <w:rFonts w:ascii="Arial" w:hAnsi="Arial"/>
-                <w:sz w:val="17"/>
+                <w:sz w:val="18"/>
               </w:rPr>
               <w:t>FastAPI and Uvicorn</w:t>
             </w:r>
@@ -2453,7 +2474,7 @@
             <w:r>
               <w:rPr>
                 <w:rFonts w:ascii="Arial" w:hAnsi="Arial"/>
-                <w:sz w:val="17"/>
+                <w:sz w:val="18"/>
               </w:rPr>
               <w:t>REST endpoints, validation, polling, and OpenAPI documentation</w:t>
             </w:r>
@@ -2483,7 +2504,7 @@
             <w:r>
               <w:rPr>
                 <w:rFonts w:ascii="Arial" w:hAnsi="Arial"/>
-                <w:sz w:val="17"/>
+                <w:sz w:val="18"/>
               </w:rPr>
               <w:t>Contracts</w:t>
             </w:r>
@@ -2508,7 +2529,7 @@
             <w:r>
               <w:rPr>
                 <w:rFonts w:ascii="Arial" w:hAnsi="Arial"/>
-                <w:sz w:val="17"/>
+                <w:sz w:val="18"/>
               </w:rPr>
               <w:t>Pydantic 2</w:t>
             </w:r>
@@ -2533,7 +2554,7 @@
             <w:r>
               <w:rPr>
                 <w:rFonts w:ascii="Arial" w:hAnsi="Arial"/>
-                <w:sz w:val="17"/>
+                <w:sz w:val="18"/>
               </w:rPr>
               <w:t>Request, response, finding, and CBOM model validation</w:t>
             </w:r>
@@ -2562,7 +2583,7 @@
             <w:r>
               <w:rPr>
                 <w:rFonts w:ascii="Arial" w:hAnsi="Arial"/>
-                <w:sz w:val="17"/>
+                <w:sz w:val="18"/>
               </w:rPr>
               <w:t>Persistence</w:t>
             </w:r>
@@ -2586,7 +2607,7 @@
             <w:r>
               <w:rPr>
                 <w:rFonts w:ascii="Arial" w:hAnsi="Arial"/>
-                <w:sz w:val="17"/>
+                <w:sz w:val="18"/>
               </w:rPr>
               <w:t>SQLAlchemy 2 with SQLite default</w:t>
             </w:r>
@@ -2610,7 +2631,7 @@
             <w:r>
               <w:rPr>
                 <w:rFonts w:ascii="Arial" w:hAnsi="Arial"/>
-                <w:sz w:val="17"/>
+                <w:sz w:val="18"/>
               </w:rPr>
               <w:t>Scans, assets, recommendations, jobs, and threat configuration</w:t>
             </w:r>
@@ -2640,7 +2661,7 @@
             <w:r>
               <w:rPr>
                 <w:rFonts w:ascii="Arial" w:hAnsi="Arial"/>
-                <w:sz w:val="17"/>
+                <w:sz w:val="18"/>
               </w:rPr>
               <w:t>Discovery</w:t>
             </w:r>
@@ -2665,7 +2686,7 @@
             <w:r>
               <w:rPr>
                 <w:rFonts w:ascii="Arial" w:hAnsi="Arial"/>
-                <w:sz w:val="17"/>
+                <w:sz w:val="18"/>
               </w:rPr>
               <w:t>Tree sitter, cryptography, PyYAML, packaging</w:t>
             </w:r>
@@ -2690,7 +2711,7 @@
             <w:r>
               <w:rPr>
                 <w:rFonts w:ascii="Arial" w:hAnsi="Arial"/>
-                <w:sz w:val="17"/>
+                <w:sz w:val="18"/>
               </w:rPr>
               <w:t>AST inspection, X509 parsing, configuration and package analysis</w:t>
             </w:r>
@@ -2719,7 +2740,7 @@
             <w:r>
               <w:rPr>
                 <w:rFonts w:ascii="Arial" w:hAnsi="Arial"/>
-                <w:sz w:val="17"/>
+                <w:sz w:val="18"/>
               </w:rPr>
               <w:t>Reporting</w:t>
             </w:r>
@@ -2743,7 +2764,7 @@
             <w:r>
               <w:rPr>
                 <w:rFonts w:ascii="Arial" w:hAnsi="Arial"/>
-                <w:sz w:val="17"/>
+                <w:sz w:val="18"/>
               </w:rPr>
               <w:t>ReportLab and openpyxl</w:t>
             </w:r>
@@ -2767,7 +2788,7 @@
             <w:r>
               <w:rPr>
                 <w:rFonts w:ascii="Arial" w:hAnsi="Arial"/>
-                <w:sz w:val="17"/>
+                <w:sz w:val="18"/>
               </w:rPr>
               <w:t>PDF and spreadsheet generation</w:t>
             </w:r>
@@ -2797,7 +2818,7 @@
             <w:r>
               <w:rPr>
                 <w:rFonts w:ascii="Arial" w:hAnsi="Arial"/>
-                <w:sz w:val="17"/>
+                <w:sz w:val="18"/>
               </w:rPr>
               <w:t>Verification</w:t>
             </w:r>
@@ -2822,7 +2843,7 @@
             <w:r>
               <w:rPr>
                 <w:rFonts w:ascii="Arial" w:hAnsi="Arial"/>
-                <w:sz w:val="17"/>
+                <w:sz w:val="18"/>
               </w:rPr>
               <w:t>pytest and Vitest</w:t>
             </w:r>
@@ -2847,9 +2868,50 @@
             <w:r>
               <w:rPr>
                 <w:rFonts w:ascii="Arial" w:hAnsi="Arial"/>
-                <w:sz w:val="17"/>
+                <w:sz w:val="18"/>
               </w:rPr>
               <w:t>Backend, scanner, integration, and frontend behavior tests</w:t>
+            </w:r>
+          </w:p>
+        </w:tc>
+      </w:tr>
+      <w:tr>
+        <w:tc>
+          <w:tcPr>
+            <w:tcW w:type="dxa" w:w="3331"/>
+          </w:tcPr>
+          <w:p>
+            <w:r>
+              <w:rPr>
+                <w:sz w:val="18"/>
+              </w:rPr>
+              <w:t>Worker coordination</w:t>
+            </w:r>
+          </w:p>
+        </w:tc>
+        <w:tc>
+          <w:tcPr>
+            <w:tcW w:type="dxa" w:w="3331"/>
+          </w:tcPr>
+          <w:p>
+            <w:r>
+              <w:rPr>
+                <w:sz w:val="18"/>
+              </w:rPr>
+              <w:t>Filelock</w:t>
+            </w:r>
+          </w:p>
+        </w:tc>
+        <w:tc>
+          <w:tcPr>
+            <w:tcW w:type="dxa" w:w="3331"/>
+          </w:tcPr>
+          <w:p>
+            <w:r>
+              <w:rPr>
+                <w:sz w:val="18"/>
+              </w:rPr>
+              <w:t>Single-worker ownership across supported operating systems</w:t>
             </w:r>
           </w:p>
         </w:tc>
@@ -2865,6 +2927,9 @@
         <w:pStyle w:val="Heading1"/>
       </w:pPr>
       <w:r>
+        <w:rPr>
+          <w:color w:val="000000"/>
+        </w:rPr>
         <w:t>Key Dependencies Between Layers</w:t>
       </w:r>
     </w:p>
@@ -2927,6 +2992,9 @@
         <w:pStyle w:val="Heading1"/>
       </w:pPr>
       <w:r>
+        <w:rPr>
+          <w:color w:val="000000"/>
+        </w:rPr>
         <w:t>API Surface</w:t>
       </w:r>
     </w:p>
@@ -3025,7 +3093,7 @@
             <w:r>
               <w:rPr>
                 <w:rFonts w:ascii="Arial" w:hAnsi="Arial"/>
-                <w:sz w:val="17"/>
+                <w:sz w:val="18"/>
               </w:rPr>
               <w:t>POST /scans</w:t>
             </w:r>
@@ -3049,7 +3117,7 @@
             <w:r>
               <w:rPr>
                 <w:rFonts w:ascii="Arial" w:hAnsi="Arial"/>
-                <w:sz w:val="17"/>
+                <w:sz w:val="18"/>
               </w:rPr>
               <w:t>Validate a path, Git URL, or image target and create a queued scan</w:t>
             </w:r>
@@ -3079,7 +3147,7 @@
             <w:r>
               <w:rPr>
                 <w:rFonts w:ascii="Arial" w:hAnsi="Arial"/>
-                <w:sz w:val="17"/>
+                <w:sz w:val="18"/>
               </w:rPr>
               <w:t>POST /scans/upload</w:t>
             </w:r>
@@ -3104,7 +3172,7 @@
             <w:r>
               <w:rPr>
                 <w:rFonts w:ascii="Arial" w:hAnsi="Arial"/>
-                <w:sz w:val="17"/>
+                <w:sz w:val="18"/>
               </w:rPr>
               <w:t>Upload a file, ZIP, or image inventory and create a queued scan</w:t>
             </w:r>
@@ -3133,7 +3201,7 @@
             <w:r>
               <w:rPr>
                 <w:rFonts w:ascii="Arial" w:hAnsi="Arial"/>
-                <w:sz w:val="17"/>
+                <w:sz w:val="18"/>
               </w:rPr>
               <w:t>GET /scans and GET /scans/{id}</w:t>
             </w:r>
@@ -3157,7 +3225,7 @@
             <w:r>
               <w:rPr>
                 <w:rFonts w:ascii="Arial" w:hAnsi="Arial"/>
-                <w:sz w:val="17"/>
+                <w:sz w:val="18"/>
               </w:rPr>
               <w:t>List history and poll lifecycle state</w:t>
             </w:r>
@@ -3187,7 +3255,7 @@
             <w:r>
               <w:rPr>
                 <w:rFonts w:ascii="Arial" w:hAnsi="Arial"/>
-                <w:sz w:val="17"/>
+                <w:sz w:val="18"/>
               </w:rPr>
               <w:t>GET /assets and GET /assets/{id}</w:t>
             </w:r>
@@ -3212,7 +3280,7 @@
             <w:r>
               <w:rPr>
                 <w:rFonts w:ascii="Arial" w:hAnsi="Arial"/>
-                <w:sz w:val="17"/>
+                <w:sz w:val="18"/>
               </w:rPr>
               <w:t>Read paginated inventory, filters, dynamic Z results, and asset detail</w:t>
             </w:r>
@@ -3241,7 +3309,7 @@
             <w:r>
               <w:rPr>
                 <w:rFonts w:ascii="Arial" w:hAnsi="Arial"/>
-                <w:sz w:val="17"/>
+                <w:sz w:val="18"/>
               </w:rPr>
               <w:t>GET /cbom/{scan_id}</w:t>
             </w:r>
@@ -3265,7 +3333,7 @@
             <w:r>
               <w:rPr>
                 <w:rFonts w:ascii="Arial" w:hAnsi="Arial"/>
-                <w:sz w:val="17"/>
+                <w:sz w:val="18"/>
               </w:rPr>
               <w:t>Download the completed CycloneDX aligned CBOM JSON</w:t>
             </w:r>
@@ -3295,7 +3363,7 @@
             <w:r>
               <w:rPr>
                 <w:rFonts w:ascii="Arial" w:hAnsi="Arial"/>
-                <w:sz w:val="17"/>
+                <w:sz w:val="18"/>
               </w:rPr>
               <w:t>GET /reports/{scan_id}</w:t>
             </w:r>
@@ -3320,7 +3388,7 @@
             <w:r>
               <w:rPr>
                 <w:rFonts w:ascii="Arial" w:hAnsi="Arial"/>
-                <w:sz w:val="17"/>
+                <w:sz w:val="18"/>
               </w:rPr>
               <w:t>Download PDF, CSV, XLSX, or JSON reports</w:t>
             </w:r>
@@ -3349,7 +3417,7 @@
             <w:r>
               <w:rPr>
                 <w:rFonts w:ascii="Arial" w:hAnsi="Arial"/>
-                <w:sz w:val="17"/>
+                <w:sz w:val="18"/>
               </w:rPr>
               <w:t>GET and PATCH /config/threat-model</w:t>
             </w:r>
@@ -3373,7 +3441,7 @@
             <w:r>
               <w:rPr>
                 <w:rFonts w:ascii="Arial" w:hAnsi="Arial"/>
-                <w:sz w:val="17"/>
+                <w:sz w:val="18"/>
               </w:rPr>
               <w:t>Read or update threat timeline and scoring defaults</w:t>
             </w:r>
@@ -3403,7 +3471,7 @@
             <w:r>
               <w:rPr>
                 <w:rFonts w:ascii="Arial" w:hAnsi="Arial"/>
-                <w:sz w:val="17"/>
+                <w:sz w:val="18"/>
               </w:rPr>
               <w:t>GET /health</w:t>
             </w:r>
@@ -3428,9 +3496,37 @@
             <w:r>
               <w:rPr>
                 <w:rFonts w:ascii="Arial" w:hAnsi="Arial"/>
-                <w:sz w:val="17"/>
+                <w:sz w:val="18"/>
               </w:rPr>
               <w:t>Unprotected service health check</w:t>
+            </w:r>
+          </w:p>
+        </w:tc>
+      </w:tr>
+      <w:tr>
+        <w:tc>
+          <w:tcPr>
+            <w:tcW w:type="dxa" w:w="4997"/>
+          </w:tcPr>
+          <w:p>
+            <w:r>
+              <w:rPr>
+                <w:sz w:val="18"/>
+              </w:rPr>
+              <w:t>DELETE /scans and DELETE /scans/{id}</w:t>
+            </w:r>
+          </w:p>
+        </w:tc>
+        <w:tc>
+          <w:tcPr>
+            <w:tcW w:type="dxa" w:w="4997"/>
+          </w:tcPr>
+          <w:p>
+            <w:r>
+              <w:rPr>
+                <w:sz w:val="18"/>
+              </w:rPr>
+              <w:t>Delete all saved history or one finished scan. Active jobs cause a 409 response. Both routes use the configured shared token when protection is enabled.</w:t>
             </w:r>
           </w:p>
         </w:tc>
@@ -3446,6 +3542,9 @@
         <w:pStyle w:val="Heading1"/>
       </w:pPr>
       <w:r>
+        <w:rPr>
+          <w:color w:val="000000"/>
+        </w:rPr>
         <w:t>Input and Security Boundaries</w:t>
       </w:r>
     </w:p>
@@ -3500,7 +3599,7 @@
         <w:spacing w:after="60"/>
       </w:pPr>
       <w:r>
-        <w:t>The persisted worker queue recovers interrupted work but intentionally permits one API worker for each state directory.</w:t>
+        <w:t>The persisted worker queue recovers interrupted work and permits one API worker per state directory. Filelock replaces the Unix-only fcntl import with a platform-aware process lock.</w:t>
       </w:r>
     </w:p>
     <w:p>
@@ -3508,6 +3607,9 @@
         <w:pStyle w:val="Heading1"/>
       </w:pPr>
       <w:r>
+        <w:rPr>
+          <w:color w:val="000000"/>
+        </w:rPr>
         <w:t>User Interface</w:t>
       </w:r>
     </w:p>
@@ -3531,7 +3633,7 @@
         <w:spacing w:after="60"/>
       </w:pPr>
       <w:r>
-        <w:t>Inventory provides search, filters, pagination, and asset selection.</w:t>
+        <w:t>Inventory provides search, filters and asset selection; the API supplies paginated data.</w:t>
       </w:r>
     </w:p>
     <w:p>
@@ -3540,7 +3642,7 @@
         <w:spacing w:after="60"/>
       </w:pPr>
       <w:r>
-        <w:t>Risk Heatmap changes the Z timeline for exploration while preserving saved results.</w:t>
+        <w:t>Risk Heatmap groups asset counts by business criticality and risk tier. Selecting a populated cell lists all its assets. The Z timeline is exploratory; displayed years use at most two decimals, and the interface explains X, Y and Z.</w:t>
       </w:r>
     </w:p>
     <w:p>
@@ -3566,6 +3668,9 @@
         <w:pStyle w:val="Heading1"/>
       </w:pPr>
       <w:r>
+        <w:rPr>
+          <w:color w:val="000000"/>
+        </w:rPr>
         <w:t>Current Limitations</w:t>
       </w:r>
     </w:p>
@@ -3575,7 +3680,7 @@
         <w:spacing w:after="60"/>
       </w:pPr>
       <w:r>
-        <w:t>Live image scanning needs Trivy and registry access. The offline JSON route was verified in this environment; the live route was not because Trivy and a Docker daemon were unavailable.</w:t>
+        <w:t>Live image scanning needs Trivy and registry access. The offline JSON route is verified; live Trivy scanning remains unverified in this environment.</w:t>
       </w:r>
     </w:p>
     <w:p>
@@ -3628,6 +3733,9 @@
         <w:pStyle w:val="Heading1"/>
       </w:pPr>
       <w:r>
+        <w:rPr>
+          <w:color w:val="000000"/>
+        </w:rPr>
         <w:t>Future Scope</w:t>
       </w:r>
     </w:p>
@@ -3751,7 +3859,7 @@
             <w:r>
               <w:rPr>
                 <w:rFonts w:ascii="Arial" w:hAnsi="Arial"/>
-                <w:sz w:val="17"/>
+                <w:sz w:val="18"/>
               </w:rPr>
               <w:t>Near term</w:t>
             </w:r>
@@ -3775,7 +3883,7 @@
             <w:r>
               <w:rPr>
                 <w:rFonts w:ascii="Arial" w:hAnsi="Arial"/>
-                <w:sz w:val="17"/>
+                <w:sz w:val="18"/>
               </w:rPr>
               <w:t>Formal CycloneDX schema validation and golden interoperability tests</w:t>
             </w:r>
@@ -3799,7 +3907,7 @@
             <w:r>
               <w:rPr>
                 <w:rFonts w:ascii="Arial" w:hAnsi="Arial"/>
-                <w:sz w:val="17"/>
+                <w:sz w:val="18"/>
               </w:rPr>
               <w:t>Makes exported CBOMs dependable for downstream tools</w:t>
             </w:r>
@@ -3829,7 +3937,7 @@
             <w:r>
               <w:rPr>
                 <w:rFonts w:ascii="Arial" w:hAnsi="Arial"/>
-                <w:sz w:val="17"/>
+                <w:sz w:val="18"/>
               </w:rPr>
               <w:t>Near term</w:t>
             </w:r>
@@ -3854,7 +3962,7 @@
             <w:r>
               <w:rPr>
                 <w:rFonts w:ascii="Arial" w:hAnsi="Arial"/>
-                <w:sz w:val="17"/>
+                <w:sz w:val="18"/>
               </w:rPr>
               <w:t>CI integration with SARIF or a GitHub Action</w:t>
             </w:r>
@@ -3879,7 +3987,7 @@
             <w:r>
               <w:rPr>
                 <w:rFonts w:ascii="Arial" w:hAnsi="Arial"/>
-                <w:sz w:val="17"/>
+                <w:sz w:val="18"/>
               </w:rPr>
               <w:t>Moves discovery into normal development workflows</w:t>
             </w:r>
@@ -3908,7 +4016,7 @@
             <w:r>
               <w:rPr>
                 <w:rFonts w:ascii="Arial" w:hAnsi="Arial"/>
-                <w:sz w:val="17"/>
+                <w:sz w:val="18"/>
               </w:rPr>
               <w:t>Near term</w:t>
             </w:r>
@@ -3932,7 +4040,7 @@
             <w:r>
               <w:rPr>
                 <w:rFonts w:ascii="Arial" w:hAnsi="Arial"/>
-                <w:sz w:val="17"/>
+                <w:sz w:val="18"/>
               </w:rPr>
               <w:t>Rule packs and measured precision and recall datasets</w:t>
             </w:r>
@@ -3956,7 +4064,7 @@
             <w:r>
               <w:rPr>
                 <w:rFonts w:ascii="Arial" w:hAnsi="Arial"/>
-                <w:sz w:val="17"/>
+                <w:sz w:val="18"/>
               </w:rPr>
               <w:t>Improves scanner quality and makes progress measurable</w:t>
             </w:r>
@@ -3986,7 +4094,7 @@
             <w:r>
               <w:rPr>
                 <w:rFonts w:ascii="Arial" w:hAnsi="Arial"/>
-                <w:sz w:val="17"/>
+                <w:sz w:val="18"/>
               </w:rPr>
               <w:t>Medium term</w:t>
             </w:r>
@@ -4011,7 +4119,7 @@
             <w:r>
               <w:rPr>
                 <w:rFonts w:ascii="Arial" w:hAnsi="Arial"/>
-                <w:sz w:val="17"/>
+                <w:sz w:val="18"/>
               </w:rPr>
               <w:t>Distributed queue, PostgreSQL deployment, telemetry, and retention</w:t>
             </w:r>
@@ -4036,7 +4144,7 @@
             <w:r>
               <w:rPr>
                 <w:rFonts w:ascii="Arial" w:hAnsi="Arial"/>
-                <w:sz w:val="17"/>
+                <w:sz w:val="18"/>
               </w:rPr>
               <w:t>Supports larger repositories and concurrent teams</w:t>
             </w:r>
@@ -4065,7 +4173,7 @@
             <w:r>
               <w:rPr>
                 <w:rFonts w:ascii="Arial" w:hAnsi="Arial"/>
-                <w:sz w:val="17"/>
+                <w:sz w:val="18"/>
               </w:rPr>
               <w:t>Medium term</w:t>
             </w:r>
@@ -4089,7 +4197,7 @@
             <w:r>
               <w:rPr>
                 <w:rFonts w:ascii="Arial" w:hAnsi="Arial"/>
-                <w:sz w:val="17"/>
+                <w:sz w:val="18"/>
               </w:rPr>
               <w:t>OIDC or SSO, RBAC, tenants, and audit history</w:t>
             </w:r>
@@ -4113,7 +4221,7 @@
             <w:r>
               <w:rPr>
                 <w:rFonts w:ascii="Arial" w:hAnsi="Arial"/>
-                <w:sz w:val="17"/>
+                <w:sz w:val="18"/>
               </w:rPr>
               <w:t>Creates accountable enterprise access</w:t>
             </w:r>
@@ -4143,7 +4251,7 @@
             <w:r>
               <w:rPr>
                 <w:rFonts w:ascii="Arial" w:hAnsi="Arial"/>
-                <w:sz w:val="17"/>
+                <w:sz w:val="18"/>
               </w:rPr>
               <w:t>Longer term</w:t>
             </w:r>
@@ -4168,7 +4276,7 @@
             <w:r>
               <w:rPr>
                 <w:rFonts w:ascii="Arial" w:hAnsi="Arial"/>
-                <w:sz w:val="17"/>
+                <w:sz w:val="18"/>
               </w:rPr>
               <w:t>Cloud KMS, network TLS, deeper binaries, HSM and certificate lifecycle</w:t>
             </w:r>
@@ -4193,7 +4301,7 @@
             <w:r>
               <w:rPr>
                 <w:rFonts w:ascii="Arial" w:hAnsi="Arial"/>
-                <w:sz w:val="17"/>
+                <w:sz w:val="18"/>
               </w:rPr>
               <w:t>Extends visibility beyond static repository evidence</w:t>
             </w:r>
@@ -4211,6 +4319,9 @@
         <w:pStyle w:val="Heading1"/>
       </w:pPr>
       <w:r>
+        <w:rPr>
+          <w:color w:val="000000"/>
+        </w:rPr>
         <w:t>Repository References</w:t>
       </w:r>
     </w:p>
@@ -4273,6 +4384,9 @@
         <w:pStyle w:val="Heading1"/>
       </w:pPr>
       <w:r>
+        <w:rPr>
+          <w:color w:val="000000"/>
+        </w:rPr>
         <w:t>External References</w:t>
       </w:r>
     </w:p>
@@ -4373,6 +4487,288 @@
           <w:t>SQLAlchemy ORM Documentation</w:t>
         </w:r>
       </w:hyperlink>
+    </w:p>
+    <w:p>
+      <w:pPr>
+        <w:pStyle w:val="Heading1"/>
+      </w:pPr>
+      <w:r>
+        <w:rPr>
+          <w:color w:val="000000"/>
+        </w:rPr>
+        <w:t>Local Startup and History Management</w:t>
+      </w:r>
+    </w:p>
+    <w:p>
+      <w:r>
+        <w:t>ecdat.bat provides the Windows entry point. scripts/launcher.py checks Python, Node.js and Git versions, writable folders, backend imports, pip consistency and frontend packages. Setup creates or repairs the virtual environment, installs dependencies and builds the frontend. Run options cover development, a built local preview, either service separately, tests and manual commands. Default ports are 8000 for the API and 3001 for the dashboard.</w:t>
+      </w:r>
+    </w:p>
+    <w:p>
+      <w:r>
+        <w:t>Default launcher modes bind to loopback, check readiness, write logs to .ecdat/logs and stop only their own processes. LAN mode (menu 9 or ecdat.bat lan) builds the dashboard and listens on all IPv4 interfaces. Its API stays on loopback behind the frontend proxy. A per-run access token is generated unless ECDAT_API_TOKEN is already set. Clients use the printed host IPv4 URL and enter the token in the dashboard. Local path means a path on the host; uploads select files from the client.</w:t>
+      </w:r>
+    </w:p>
+    <w:p>
+      <w:r>
+        <w:t>History deletion removes Scan, Asset, Recommendation and ScanJob records, including stored CBOM and report data. Source files, uploaded input copies and already downloaded reports remain intact. The dashboard asks for confirmation; the API rejects deletion of queued or running scans. Bulk deletion is rejected as a whole while any job is active. Future retention policies can separately manage retained upload files.</w:t>
+      </w:r>
+    </w:p>
+    <w:p>
+      <w:r>
+        <w:t>Filelock reference: https://py-filelock.readthedocs.io/en/latest/</w:t>
+      </w:r>
+    </w:p>
+    <w:p>
+      <w:pPr>
+        <w:pStyle w:val="Heading1"/>
+      </w:pPr>
+      <w:r>
+        <w:t>Windows and Local Network Operation</w:t>
+      </w:r>
+    </w:p>
+    <w:p>
+      <w:r>
+        <w:t>The Windows entry point uses the Python launcher or Python on PATH, invokes npm.cmd where needed and does not require PowerShell activation. Filelock provides platform-aware worker ownership. The compatibility workflow runs fresh setup, the integrated tests, a frontend build and a real-process LAN smoke test on Windows and Linux, including a checkout path containing spaces. Consult the Actions result for the exact revision; a hosted runner cannot validate a user network firewall or Wi-Fi isolation setting.</w:t>
+      </w:r>
+    </w:p>
+    <w:p>
+      <w:r>
+        <w:t>LAN operation exposes the dashboard port only (3001 by default). Windows may require a Private-profile inbound firewall rule scoped to Node.js, the dashboard port and LocalSubnet. The API port does not need an inbound rule. The launcher prints candidate host IPv4 links; clients must use the host address instead of localhost. HTTP LAN mode is intended for a trusted demonstration network. A deployed HTTPS service needs a separate TLS certificate and reverse proxy. See documentation/SETUP_AND_RUN.md for exact commands and connectivity checks.</w:t>
+      </w:r>
+    </w:p>
+    <w:p>
+      <w:pPr>
+        <w:pStyle w:val="Heading1"/>
+      </w:pPr>
+      <w:r>
+        <w:t>Test Inputs and Certificate Fixtures</w:t>
+      </w:r>
+    </w:p>
+    <w:p>
+      <w:r>
+        <w:t>backend/tests and tests contain the integrated Python checks; frontend/src/api.test.ts and heatmap.test.ts contain frontend tests. Root conftest.py isolates test storage. tests/launcher_smoke.py exercises real services explicitly after setup. ecdat/tests belongs to an earlier standalone package and is outside the integrated default test paths. documentation/TEST_DATA.md maps the test code and scanner fixtures.</w:t>
+      </w:r>
+    </w:p>
+    <w:p>
+      <w:r>
+        <w:t>demo/workspace is the small source, dependency and TLS configuration demonstration. demo/image-inventory.json is a synthetic offline package inventory. seed_corpus contains language examples, false-positive traps, dependency manifests, nginx configurations, infrastructure files, binary-style text evidence and certificates. Requirements files inside those input directories are for scanning, not installing ECDAT.</w:t>
+      </w:r>
+    </w:p>
+    <w:tbl>
+      <w:tblPr>
+        <w:tblStyle w:val="TableGrid"/>
+        <w:tblW w:type="auto" w:w="0"/>
+        <w:tblLayout w:type="fixed"/>
+        <w:tblLook w:firstColumn="1" w:firstRow="1" w:lastColumn="0" w:lastRow="0" w:noHBand="0" w:noVBand="1" w:val="04A0"/>
+        <w:tblBorders>
+          <w:top w:val="single" w:sz="4" w:color="D9D9D9"/>
+          <w:left w:val="single" w:sz="4" w:color="D9D9D9"/>
+          <w:bottom w:val="single" w:sz="4" w:color="D9D9D9"/>
+          <w:right w:val="single" w:sz="4" w:color="D9D9D9"/>
+          <w:insideH w:val="single" w:sz="4" w:color="D9D9D9"/>
+          <w:insideV w:val="single" w:sz="4" w:color="D9D9D9"/>
+        </w:tblBorders>
+      </w:tblPr>
+      <w:tblGrid>
+        <w:gridCol w:w="3168"/>
+        <w:gridCol w:w="6912"/>
+      </w:tblGrid>
+      <w:tr>
+        <w:tc>
+          <w:tcPr>
+            <w:tcW w:type="dxa" w:w="3168"/>
+            <w:shd w:fill="20384F"/>
+            <w:vAlign w:val="center"/>
+          </w:tcPr>
+          <w:p>
+            <w:pPr>
+              <w:spacing w:before="100" w:after="100"/>
+            </w:pPr>
+            <w:r>
+              <w:rPr>
+                <w:b/>
+                <w:color w:val="FFFFFF"/>
+                <w:sz w:val="18"/>
+              </w:rPr>
+              <w:t>Certificate fixture</w:t>
+            </w:r>
+          </w:p>
+        </w:tc>
+        <w:tc>
+          <w:tcPr>
+            <w:tcW w:type="dxa" w:w="6912"/>
+            <w:shd w:fill="20384F"/>
+            <w:vAlign w:val="center"/>
+          </w:tcPr>
+          <w:p>
+            <w:pPr>
+              <w:spacing w:before="100" w:after="100"/>
+            </w:pPr>
+            <w:r>
+              <w:rPr>
+                <w:b/>
+                <w:color w:val="FFFFFF"/>
+                <w:sz w:val="18"/>
+              </w:rPr>
+              <w:t>Purpose</w:t>
+            </w:r>
+          </w:p>
+        </w:tc>
+      </w:tr>
+      <w:tr>
+        <w:tc>
+          <w:tcPr>
+            <w:tcW w:type="dxa" w:w="3168"/>
+            <w:vAlign w:val="center"/>
+          </w:tcPr>
+          <w:p>
+            <w:pPr>
+              <w:spacing w:before="100" w:after="100"/>
+            </w:pPr>
+            <w:r>
+              <w:rPr>
+                <w:sz w:val="18"/>
+              </w:rPr>
+              <w:t>good_rsa2048.pem</w:t>
+            </w:r>
+          </w:p>
+        </w:tc>
+        <w:tc>
+          <w:tcPr>
+            <w:tcW w:type="dxa" w:w="6912"/>
+            <w:vAlign w:val="center"/>
+          </w:tcPr>
+          <w:p>
+            <w:pPr>
+              <w:spacing w:before="100" w:after="100"/>
+            </w:pPr>
+            <w:r>
+              <w:rPr>
+                <w:sz w:val="18"/>
+              </w:rPr>
+              <w:t>RSA 2048, SHA-256, 365 days; comparison without small-key, weak-signature or long-validity flags.</w:t>
+            </w:r>
+          </w:p>
+        </w:tc>
+      </w:tr>
+      <w:tr>
+        <w:tc>
+          <w:tcPr>
+            <w:tcW w:type="dxa" w:w="3168"/>
+            <w:vAlign w:val="center"/>
+            <w:shd w:fill="F3F6F9"/>
+          </w:tcPr>
+          <w:p>
+            <w:pPr>
+              <w:spacing w:before="100" w:after="100"/>
+            </w:pPr>
+            <w:r>
+              <w:rPr>
+                <w:sz w:val="18"/>
+              </w:rPr>
+              <w:t>small_rsa1024.pem</w:t>
+            </w:r>
+          </w:p>
+        </w:tc>
+        <w:tc>
+          <w:tcPr>
+            <w:tcW w:type="dxa" w:w="6912"/>
+            <w:vAlign w:val="center"/>
+            <w:shd w:fill="F3F6F9"/>
+          </w:tcPr>
+          <w:p>
+            <w:pPr>
+              <w:spacing w:before="100" w:after="100"/>
+            </w:pPr>
+            <w:r>
+              <w:rPr>
+                <w:sz w:val="18"/>
+              </w:rPr>
+              <w:t>RSA 1024, SHA-256, 365 days; undersized-key detection.</w:t>
+            </w:r>
+          </w:p>
+        </w:tc>
+      </w:tr>
+      <w:tr>
+        <w:tc>
+          <w:tcPr>
+            <w:tcW w:type="dxa" w:w="3168"/>
+            <w:vAlign w:val="center"/>
+          </w:tcPr>
+          <w:p>
+            <w:pPr>
+              <w:spacing w:before="100" w:after="100"/>
+            </w:pPr>
+            <w:r>
+              <w:rPr>
+                <w:sz w:val="18"/>
+              </w:rPr>
+              <w:t>sha1_signed.pem</w:t>
+            </w:r>
+          </w:p>
+        </w:tc>
+        <w:tc>
+          <w:tcPr>
+            <w:tcW w:type="dxa" w:w="6912"/>
+            <w:vAlign w:val="center"/>
+          </w:tcPr>
+          <w:p>
+            <w:pPr>
+              <w:spacing w:before="100" w:after="100"/>
+            </w:pPr>
+            <w:r>
+              <w:rPr>
+                <w:sz w:val="18"/>
+              </w:rPr>
+              <w:t>RSA 2048, SHA-1, 365 days; weak-signature detection.</w:t>
+            </w:r>
+          </w:p>
+        </w:tc>
+      </w:tr>
+      <w:tr>
+        <w:tc>
+          <w:tcPr>
+            <w:tcW w:type="dxa" w:w="3168"/>
+            <w:vAlign w:val="center"/>
+            <w:shd w:fill="F3F6F9"/>
+          </w:tcPr>
+          <w:p>
+            <w:pPr>
+              <w:spacing w:before="100" w:after="100"/>
+            </w:pPr>
+            <w:r>
+              <w:rPr>
+                <w:sz w:val="18"/>
+              </w:rPr>
+              <w:t>long_validity.pem</w:t>
+            </w:r>
+          </w:p>
+        </w:tc>
+        <w:tc>
+          <w:tcPr>
+            <w:tcW w:type="dxa" w:w="6912"/>
+            <w:vAlign w:val="center"/>
+            <w:shd w:fill="F3F6F9"/>
+          </w:tcPr>
+          <w:p>
+            <w:pPr>
+              <w:spacing w:before="100" w:after="100"/>
+            </w:pPr>
+            <w:r>
+              <w:rPr>
+                <w:sz w:val="18"/>
+              </w:rPr>
+              <w:t>RSA 2048, SHA-256, 3650 days; excessive-validity detection.</w:t>
+            </w:r>
+          </w:p>
+        </w:tc>
+      </w:tr>
+    </w:tbl>
+    <w:p>
+      <w:r>
+        <w:t>All four PEM files under seed_corpus/certs are public self-signed test certificates. They are not dashboard TLS credentials and must not be installed in a trusted root store. Self-signed detection can contribute additional findings. The certificate rules are covered by backend/tests/test_infra_certs.py.</w:t>
+      </w:r>
     </w:p>
     <w:sectPr>
       <w:headerReference w:type="default" r:id="rId9"/>

</xml_diff>

<commit_message>
Increase configurable scan capacity for large repositories
</commit_message>
<xml_diff>
--- a/documentation/ECDAT_Technical_Reference.docx
+++ b/documentation/ECDAT_Technical_Reference.docx
@@ -176,7 +176,7 @@
           </w:tcPr>
           <w:p>
             <w:r>
-              <w:t>Working tree based on 79ebb9e</w:t>
+              <w:t>Working tree based on 49f581b</w:t>
             </w:r>
           </w:p>
         </w:tc>
@@ -217,7 +217,7 @@
           </w:tcPr>
           <w:p>
             <w:r>
-              <w:t>09 September 2026</w:t>
+              <w:t>10 September 2026</w:t>
             </w:r>
           </w:p>
         </w:tc>
@@ -842,7 +842,7 @@
     </w:p>
     <w:p>
       <w:r>
-        <w:t>The supplied workspace produces 10 assets with 3 Critical findings, and the offline image inventory produces 2 assets. Git scan counts vary with repository content. The updated build passes 83 backend tests, 23 frontend tests and a production build. Browser checks cover grouped heatmap navigation, decimal formatting, confirmation and persistent history deletion.</w:t>
+        <w:t>The supplied workspace produces 10 assets with 3 Critical findings, and the offline image inventory produces 2 assets. Git scan counts vary with repository content. The updated build passes 100 backend tests, 24 frontend tests and a production build. Browser checks cover grouped heatmap navigation, decimal formatting, confirmation and persistent history deletion.</w:t>
       </w:r>
     </w:p>
     <w:p>
@@ -3563,7 +3563,7 @@
         <w:spacing w:after="60"/>
       </w:pPr>
       <w:r>
-        <w:t>Git input accepts public HTTPS URLs from an allowlist. Clones are shallow, noninteractive, bounded by a 120 second timeout, and configured to reject redirects and local file transport.</w:t>
+        <w:t>Git input accepts public HTTPS URLs from an allowlist. Clones are shallow, noninteractive, bounded by a configurable 600 second timeout by default, and configured to reject redirects and local file transport.</w:t>
       </w:r>
     </w:p>
     <w:p>
@@ -3572,7 +3572,7 @@
         <w:spacing w:after="60"/>
       </w:pPr>
       <w:r>
-        <w:t>Uploads are limited to 20 MB. Expanded workspaces and ZIP files are limited to 100 MB and 10000 files or entries.</w:t>
+        <w:t>Default limits are 512 MiB per upload, 2 GiB per local file or expanded workspace, and 100,000 snapshot files or ZIP entries. Image JSON inventories allow 128 MiB and also obey the upload cap when uploaded. Positive integer environment settings control these limits; the launcher prints their effective values. The browser permits 30 minutes for upload transfer. See SETUP_AND_RUN.md for Windows commands and resource considerations. These are acceptance limits; the single worker and in-memory parsers still depend on available disk and RAM.</w:t>
       </w:r>
     </w:p>
     <w:p>

</xml_diff>